<commit_message>
Bildiri Özeti Formu (Abstract Writing Format) güncel hali yüklendi
Co-Authored-By: Claude Opus 4.6 (1M context) <noreply@anthropic.com>
</commit_message>
<xml_diff>
--- a/fotolar/bildiri-yazim-formati.docx
+++ b/fotolar/bildiri-yazim-formati.docx
@@ -339,28 +339,14 @@
           <w:sz w:val="20"/>
           <w:szCs w:val="20"/>
         </w:rPr>
-        <w:t>Sedimantoloji Çalışma Grubu 20</w:t>
-      </w:r>
-      <w:r>
-        <w:rPr>
-          <w:sz w:val="20"/>
-          <w:szCs w:val="20"/>
-        </w:rPr>
-        <w:t>2</w:t>
-      </w:r>
-      <w:r>
-        <w:rPr>
-          <w:sz w:val="20"/>
-          <w:szCs w:val="20"/>
-        </w:rPr>
-        <w:t>4</w:t>
-      </w:r>
-      <w:r>
-        <w:rPr>
-          <w:sz w:val="20"/>
-          <w:szCs w:val="20"/>
-        </w:rPr>
-        <w:t xml:space="preserve"> Çalıştayına</w:t>
+        <w:t xml:space="preserve">Uluslararası Katılımlı Erzincan Jeolojik ve Kültürel Miras </w:t>
+      </w:r>
+      <w:r>
+        <w:rPr>
+          <w:sz w:val="20"/>
+          <w:szCs w:val="20"/>
+        </w:rPr>
+        <w:t>Çalıştayına</w:t>
       </w:r>
       <w:r>
         <w:rPr>
@@ -1242,7 +1228,25 @@
           <w:sz w:val="20"/>
           <w:szCs w:val="20"/>
         </w:rPr>
-        <w:t xml:space="preserve"> of the </w:t>
+        <w:t xml:space="preserve"> of </w:t>
+      </w:r>
+      <w:proofErr w:type="spellStart"/>
+      <w:r>
+        <w:rPr>
+          <w:i/>
+          <w:sz w:val="20"/>
+          <w:szCs w:val="20"/>
+        </w:rPr>
+        <w:t>the</w:t>
+      </w:r>
+      <w:proofErr w:type="spellEnd"/>
+      <w:r>
+        <w:rPr>
+          <w:i/>
+          <w:sz w:val="20"/>
+          <w:szCs w:val="20"/>
+        </w:rPr>
+        <w:t xml:space="preserve"> </w:t>
       </w:r>
       <w:proofErr w:type="spellStart"/>
       <w:r>
@@ -2078,6 +2082,7 @@
     </w:p>
     <w:sectPr>
       <w:headerReference w:type="default" r:id="rId7"/>
+      <w:footerReference w:type="default" r:id="rId8"/>
       <w:pgSz w:w="11906" w:h="16838" w:code="9"/>
       <w:pgMar w:top="2268" w:right="1701" w:bottom="2268" w:left="1701" w:header="709" w:footer="709" w:gutter="0"/>
       <w:cols w:space="708"/>
@@ -2104,6 +2109,161 @@
     </w:p>
   </w:endnote>
 </w:endnotes>
+</file>
+
+<file path=word/footer1.xml><?xml version="1.0" encoding="utf-8"?>
+<w:ftr xmlns:wpc="http://schemas.microsoft.com/office/word/2010/wordprocessingCanvas" xmlns:cx="http://schemas.microsoft.com/office/drawing/2014/chartex" xmlns:cx1="http://schemas.microsoft.com/office/drawing/2015/9/8/chartex" xmlns:cx2="http://schemas.microsoft.com/office/drawing/2015/10/21/chartex" xmlns:cx3="http://schemas.microsoft.com/office/drawing/2016/5/9/chartex" xmlns:cx4="http://schemas.microsoft.com/office/drawing/2016/5/10/chartex" xmlns:cx5="http://schemas.microsoft.com/office/drawing/2016/5/11/chartex" xmlns:cx6="http://schemas.microsoft.com/office/drawing/2016/5/12/chartex" xmlns:cx7="http://schemas.microsoft.com/office/drawing/2016/5/13/chartex" xmlns:cx8="http://schemas.microsoft.com/office/drawing/2016/5/14/chartex" xmlns:mc="http://schemas.openxmlformats.org/markup-compatibility/2006" xmlns:aink="http://schemas.microsoft.com/office/drawing/2016/ink" xmlns:am3d="http://schemas.microsoft.com/office/drawing/2017/model3d" xmlns:o="urn:schemas-microsoft-com:office:office" xmlns:oel="http://schemas.microsoft.com/office/2019/extlst" xmlns:r="http://schemas.openxmlformats.org/officeDocument/2006/relationships" xmlns:m="http://schemas.openxmlformats.org/officeDocument/2006/math" xmlns:v="urn:schemas-microsoft-com:vml" xmlns:wp14="http://schemas.microsoft.com/office/word/2010/wordprocessingDrawing" xmlns:wp="http://schemas.openxmlformats.org/drawingml/2006/wordprocessingDrawing" xmlns:w10="urn:schemas-microsoft-com:office:word" xmlns:w="http://schemas.openxmlformats.org/wordprocessingml/2006/main" xmlns:w14="http://schemas.microsoft.com/office/word/2010/wordml" xmlns:w15="http://schemas.microsoft.com/office/word/2012/wordml" xmlns:w16cex="http://schemas.microsoft.com/office/word/2018/wordml/cex" xmlns:w16cid="http://schemas.microsoft.com/office/word/2016/wordml/cid" xmlns:w16="http://schemas.microsoft.com/office/word/2018/wordml" xmlns:w16du="http://schemas.microsoft.com/office/word/2023/wordml/word16du" xmlns:w16sdtdh="http://schemas.microsoft.com/office/word/2020/wordml/sdtdatahash" xmlns:w16sdtfl="http://schemas.microsoft.com/office/word/2024/wordml/sdtformatlock" xmlns:w16se="http://schemas.microsoft.com/office/word/2015/wordml/symex" xmlns:wpg="http://schemas.microsoft.com/office/word/2010/wordprocessingGroup" xmlns:wpi="http://schemas.microsoft.com/office/word/2010/wordprocessingInk" xmlns:wne="http://schemas.microsoft.com/office/word/2006/wordml" xmlns:wps="http://schemas.microsoft.com/office/word/2010/wordprocessingShape" mc:Ignorable="w14 w15 w16se w16cid w16 w16cex w16sdtdh w16sdtfl w16du wp14">
+  <w:p>
+    <w:pPr>
+      <w:pBdr>
+        <w:top w:val="single" w:sz="6" w:space="1" w:color="D4A853"/>
+      </w:pBdr>
+      <w:spacing w:before="120"/>
+      <w:jc w:val="center"/>
+      <w:rPr>
+        <w:sz w:val="16"/>
+        <w:szCs w:val="16"/>
+      </w:rPr>
+    </w:pPr>
+    <w:r>
+      <w:rPr>
+        <w:noProof/>
+      </w:rPr>
+      <w:drawing>
+        <wp:inline distT="0" distB="0" distL="0" distR="0" wp14:anchorId="3D9D7B64" wp14:editId="5D93785A">
+          <wp:extent cx="361950" cy="361950"/>
+          <wp:effectExtent l="0" t="0" r="0" b="0"/>
+          <wp:docPr id="3" name="EBYU Logo"/>
+          <wp:cNvGraphicFramePr>
+            <a:graphicFrameLocks xmlns:a="http://schemas.openxmlformats.org/drawingml/2006/main" noChangeAspect="1"/>
+          </wp:cNvGraphicFramePr>
+          <a:graphic xmlns:a="http://schemas.openxmlformats.org/drawingml/2006/main">
+            <a:graphicData uri="http://schemas.openxmlformats.org/drawingml/2006/picture">
+              <pic:pic xmlns:pic="http://schemas.openxmlformats.org/drawingml/2006/picture">
+                <pic:nvPicPr>
+                  <pic:cNvPr id="0" name="EBYU Logo"/>
+                  <pic:cNvPicPr>
+                    <a:picLocks noChangeAspect="1" noChangeArrowheads="1"/>
+                  </pic:cNvPicPr>
+                </pic:nvPicPr>
+                <pic:blipFill>
+                  <a:blip r:embed="rId1">
+                    <a:extLst>
+                      <a:ext uri="{28A0092B-C50C-407E-A947-70E740481C1C}">
+                        <a14:useLocalDpi xmlns:a14="http://schemas.microsoft.com/office/drawing/2010/main" val="0"/>
+                      </a:ext>
+                    </a:extLst>
+                  </a:blip>
+                  <a:srcRect/>
+                  <a:stretch>
+                    <a:fillRect/>
+                  </a:stretch>
+                </pic:blipFill>
+                <pic:spPr bwMode="auto">
+                  <a:xfrm>
+                    <a:off x="0" y="0"/>
+                    <a:ext cx="361950" cy="361950"/>
+                  </a:xfrm>
+                  <a:prstGeom prst="rect">
+                    <a:avLst/>
+                  </a:prstGeom>
+                  <a:noFill/>
+                  <a:ln>
+                    <a:noFill/>
+                  </a:ln>
+                </pic:spPr>
+              </pic:pic>
+            </a:graphicData>
+          </a:graphic>
+        </wp:inline>
+      </w:drawing>
+    </w:r>
+  </w:p>
+  <w:p>
+    <w:pPr>
+      <w:jc w:val="center"/>
+      <w:rPr>
+        <w:rFonts w:ascii="Arial" w:hAnsi="Arial"/>
+        <w:sz w:val="16"/>
+        <w:szCs w:val="16"/>
+      </w:rPr>
+    </w:pPr>
+    <w:r>
+      <w:rPr>
+        <w:rFonts w:ascii="Arial" w:hAnsi="Arial"/>
+        <w:b/>
+        <w:sz w:val="16"/>
+        <w:szCs w:val="16"/>
+      </w:rPr>
+      <w:t>Erzincan Binali Yıldırım Üniversitesi</w:t>
+    </w:r>
+  </w:p>
+  <w:p>
+    <w:pPr>
+      <w:jc w:val="center"/>
+      <w:rPr>
+        <w:rFonts w:ascii="Arial" w:hAnsi="Arial"/>
+        <w:color w:val="666666"/>
+        <w:sz w:val="15"/>
+        <w:szCs w:val="15"/>
+      </w:rPr>
+    </w:pPr>
+    <w:r>
+      <w:rPr>
+        <w:rFonts w:ascii="Arial" w:hAnsi="Arial"/>
+        <w:color w:val="666666"/>
+        <w:sz w:val="15"/>
+        <w:szCs w:val="15"/>
+      </w:rPr>
+      <w:t xml:space="preserve">Prof. Dr. Erdoğan </w:t>
+    </w:r>
+    <w:proofErr w:type="spellStart"/>
+    <w:r>
+      <w:rPr>
+        <w:rFonts w:ascii="Arial" w:hAnsi="Arial"/>
+        <w:color w:val="666666"/>
+        <w:sz w:val="15"/>
+        <w:szCs w:val="15"/>
+      </w:rPr>
+      <w:t>Büyükkasap</w:t>
+    </w:r>
+    <w:proofErr w:type="spellEnd"/>
+    <w:r>
+      <w:rPr>
+        <w:rFonts w:ascii="Arial" w:hAnsi="Arial"/>
+        <w:color w:val="666666"/>
+        <w:sz w:val="15"/>
+        <w:szCs w:val="15"/>
+      </w:rPr>
+      <w:t xml:space="preserve"> Kongre ve Kültür Merkezi • Yalnızbağ Yerleşkesi</w:t>
+    </w:r>
+  </w:p>
+  <w:p>
+    <w:pPr>
+      <w:jc w:val="center"/>
+      <w:rPr>
+        <w:rFonts w:ascii="Arial" w:hAnsi="Arial"/>
+        <w:color w:val="666666"/>
+        <w:sz w:val="15"/>
+        <w:szCs w:val="15"/>
+      </w:rPr>
+    </w:pPr>
+    <w:r>
+      <w:rPr>
+        <w:rFonts w:ascii="Arial" w:hAnsi="Arial"/>
+        <w:color w:val="666666"/>
+        <w:sz w:val="15"/>
+        <w:szCs w:val="15"/>
+      </w:rPr>
+      <w:t>erjekum2026@gmail.com    +90 446 224 3032 (Dahili: 40280)</w:t>
+    </w:r>
+  </w:p>
+  <w:p>
+    <w:pPr>
+      <w:pStyle w:val="AltBilgi"/>
+    </w:pPr>
+  </w:p>
+</w:ftr>
 </file>
 
 <file path=word/footnotes.xml><?xml version="1.0" encoding="utf-8"?>
@@ -2334,47 +2494,7 @@
                               <w:sz w:val="18"/>
                               <w:szCs w:val="18"/>
                             </w:rPr>
-                            <w:t xml:space="preserve"> </w:t>
-                          </w:r>
-                          <w:proofErr w:type="spellStart"/>
-                          <w:r>
-                            <w:rPr>
-                              <w:rFonts w:ascii="Verdana Pro Cond Semibold" w:hAnsi="Verdana Pro Cond Semibold"/>
-                              <w:i/>
-                              <w:sz w:val="18"/>
-                              <w:szCs w:val="18"/>
-                            </w:rPr>
-                            <w:t>and</w:t>
-                          </w:r>
-                          <w:proofErr w:type="spellEnd"/>
-                          <w:r>
-                            <w:rPr>
-                              <w:rFonts w:ascii="Verdana Pro Cond Semibold" w:hAnsi="Verdana Pro Cond Semibold"/>
-                              <w:i/>
-                              <w:sz w:val="18"/>
-                              <w:szCs w:val="18"/>
-                            </w:rPr>
-                            <w:t xml:space="preserve"> </w:t>
-                          </w:r>
-                          <w:proofErr w:type="spellStart"/>
-                          <w:r>
-                            <w:rPr>
-                              <w:rFonts w:ascii="Verdana Pro Cond Semibold" w:hAnsi="Verdana Pro Cond Semibold"/>
-                              <w:i/>
-                              <w:sz w:val="18"/>
-                              <w:szCs w:val="18"/>
-                            </w:rPr>
-                            <w:t>Cultural</w:t>
-                          </w:r>
-                          <w:proofErr w:type="spellEnd"/>
-                          <w:r>
-                            <w:rPr>
-                              <w:rFonts w:ascii="Verdana Pro Cond Semibold" w:hAnsi="Verdana Pro Cond Semibold"/>
-                              <w:i/>
-                              <w:sz w:val="18"/>
-                              <w:szCs w:val="18"/>
-                            </w:rPr>
-                            <w:t xml:space="preserve"> </w:t>
+                            <w:t xml:space="preserve"> and Cultural </w:t>
                           </w:r>
                           <w:proofErr w:type="spellStart"/>
                           <w:r>
@@ -2738,47 +2858,7 @@
                         <w:sz w:val="18"/>
                         <w:szCs w:val="18"/>
                       </w:rPr>
-                      <w:t xml:space="preserve"> </w:t>
-                    </w:r>
-                    <w:proofErr w:type="spellStart"/>
-                    <w:r>
-                      <w:rPr>
-                        <w:rFonts w:ascii="Verdana Pro Cond Semibold" w:hAnsi="Verdana Pro Cond Semibold"/>
-                        <w:i/>
-                        <w:sz w:val="18"/>
-                        <w:szCs w:val="18"/>
-                      </w:rPr>
-                      <w:t>and</w:t>
-                    </w:r>
-                    <w:proofErr w:type="spellEnd"/>
-                    <w:r>
-                      <w:rPr>
-                        <w:rFonts w:ascii="Verdana Pro Cond Semibold" w:hAnsi="Verdana Pro Cond Semibold"/>
-                        <w:i/>
-                        <w:sz w:val="18"/>
-                        <w:szCs w:val="18"/>
-                      </w:rPr>
-                      <w:t xml:space="preserve"> </w:t>
-                    </w:r>
-                    <w:proofErr w:type="spellStart"/>
-                    <w:r>
-                      <w:rPr>
-                        <w:rFonts w:ascii="Verdana Pro Cond Semibold" w:hAnsi="Verdana Pro Cond Semibold"/>
-                        <w:i/>
-                        <w:sz w:val="18"/>
-                        <w:szCs w:val="18"/>
-                      </w:rPr>
-                      <w:t>Cultural</w:t>
-                    </w:r>
-                    <w:proofErr w:type="spellEnd"/>
-                    <w:r>
-                      <w:rPr>
-                        <w:rFonts w:ascii="Verdana Pro Cond Semibold" w:hAnsi="Verdana Pro Cond Semibold"/>
-                        <w:i/>
-                        <w:sz w:val="18"/>
-                        <w:szCs w:val="18"/>
-                      </w:rPr>
-                      <w:t xml:space="preserve"> </w:t>
+                      <w:t xml:space="preserve"> and Cultural </w:t>
                     </w:r>
                     <w:proofErr w:type="spellStart"/>
                     <w:r>

</xml_diff>